<commit_message>
feat(lib-template): add subtotals + grand total rows
</commit_message>
<xml_diff>
--- a/backend/tests/fixtures/wmsu-lib-template-v1-sample.docx
+++ b/backend/tests/fixtures/wmsu-lib-template-v1-sample.docx
@@ -11,6 +11,7 @@
         <w:rPr>
           <w:b/>
           <w:bCs/>
+          <w:color w:val="C8102E"/>
           <w:sz w:val="28"/>
           <w:szCs w:val="28"/>
         </w:rPr>
@@ -23,6 +24,7 @@
       </w:pPr>
       <w:r>
         <w:rPr>
+          <w:color w:val="4A5568"/>
           <w:sz w:val="20"/>
           <w:szCs w:val="20"/>
         </w:rPr>
@@ -42,7 +44,19 @@
           <w:sz w:val="18"/>
           <w:szCs w:val="18"/>
         </w:rPr>
-        <w:t xml:space="preserve">Fill in one item per row. Do not add or remove columns. Category header rows (PS / MOOE / CO) separate the three sections — keep them intact. Amount should equal Qty x Unit Price.</w:t>
+        <w:t xml:space="preserve">How to use this template: Fill in one item per row. Do not add or remove columns. Keep the category header rows (PS / MOOE / CO) intact. The Amount column should equal Qty x Unit Price.</w:t>
+      </w:r>
+    </w:p>
+    <w:p>
+      <w:r>
+        <w:rPr>
+          <w:i/>
+          <w:iCs/>
+          <w:color w:val="4A5568"/>
+          <w:sz w:val="18"/>
+          <w:szCs w:val="18"/>
+        </w:rPr>
+        <w:t xml:space="preserve">Subcategory tip: If your item matches a standard subcategory (e.g. "Office Supplies", "Honoraria"), write that. If your item does not fit any standard subcategory, you have three options — all are acceptable: (1) write "Other" and refine it in the form after import, (2) write your own specific label (e.g. "IoT Sensors") and the system keeps it as-is, or (3) leave the cell blank and pick the subcategory in the form after import.</w:t>
       </w:r>
     </w:p>
     <w:p>
@@ -77,7 +91,7 @@
         </w:trPr>
         <w:tc>
           <w:tcPr>
-            <w:shd w:fill="D9D9D9"/>
+            <w:shd w:fill="C8102E"/>
           </w:tcPr>
           <w:p>
             <w:pPr>
@@ -87,6 +101,7 @@
               <w:rPr>
                 <w:b/>
                 <w:bCs/>
+                <w:color w:val="FFFFFF"/>
                 <w:sz w:val="20"/>
                 <w:szCs w:val="20"/>
               </w:rPr>
@@ -96,7 +111,7 @@
         </w:tc>
         <w:tc>
           <w:tcPr>
-            <w:shd w:fill="D9D9D9"/>
+            <w:shd w:fill="C8102E"/>
           </w:tcPr>
           <w:p>
             <w:pPr>
@@ -106,6 +121,7 @@
               <w:rPr>
                 <w:b/>
                 <w:bCs/>
+                <w:color w:val="FFFFFF"/>
                 <w:sz w:val="20"/>
                 <w:szCs w:val="20"/>
               </w:rPr>
@@ -115,7 +131,7 @@
         </w:tc>
         <w:tc>
           <w:tcPr>
-            <w:shd w:fill="D9D9D9"/>
+            <w:shd w:fill="C8102E"/>
           </w:tcPr>
           <w:p>
             <w:pPr>
@@ -125,6 +141,7 @@
               <w:rPr>
                 <w:b/>
                 <w:bCs/>
+                <w:color w:val="FFFFFF"/>
                 <w:sz w:val="20"/>
                 <w:szCs w:val="20"/>
               </w:rPr>
@@ -134,7 +151,7 @@
         </w:tc>
         <w:tc>
           <w:tcPr>
-            <w:shd w:fill="D9D9D9"/>
+            <w:shd w:fill="C8102E"/>
           </w:tcPr>
           <w:p>
             <w:pPr>
@@ -144,6 +161,7 @@
               <w:rPr>
                 <w:b/>
                 <w:bCs/>
+                <w:color w:val="FFFFFF"/>
                 <w:sz w:val="20"/>
                 <w:szCs w:val="20"/>
               </w:rPr>
@@ -153,7 +171,7 @@
         </w:tc>
         <w:tc>
           <w:tcPr>
-            <w:shd w:fill="D9D9D9"/>
+            <w:shd w:fill="C8102E"/>
           </w:tcPr>
           <w:p>
             <w:pPr>
@@ -163,6 +181,7 @@
               <w:rPr>
                 <w:b/>
                 <w:bCs/>
+                <w:color w:val="FFFFFF"/>
                 <w:sz w:val="20"/>
                 <w:szCs w:val="20"/>
               </w:rPr>
@@ -172,7 +191,7 @@
         </w:tc>
         <w:tc>
           <w:tcPr>
-            <w:shd w:fill="D9D9D9"/>
+            <w:shd w:fill="C8102E"/>
           </w:tcPr>
           <w:p>
             <w:pPr>
@@ -182,6 +201,7 @@
               <w:rPr>
                 <w:b/>
                 <w:bCs/>
+                <w:color w:val="FFFFFF"/>
                 <w:sz w:val="20"/>
                 <w:szCs w:val="20"/>
               </w:rPr>
@@ -191,7 +211,7 @@
         </w:tc>
         <w:tc>
           <w:tcPr>
-            <w:shd w:fill="D9D9D9"/>
+            <w:shd w:fill="C8102E"/>
           </w:tcPr>
           <w:p>
             <w:pPr>
@@ -201,6 +221,7 @@
               <w:rPr>
                 <w:b/>
                 <w:bCs/>
+                <w:color w:val="FFFFFF"/>
                 <w:sz w:val="20"/>
                 <w:szCs w:val="20"/>
               </w:rPr>
@@ -213,7 +234,7 @@
         <w:tc>
           <w:tcPr>
             <w:gridSpan w:val="7"/>
-            <w:shd w:fill="FFF2CC"/>
+            <w:shd w:fill="FDECEE"/>
           </w:tcPr>
           <w:p>
             <w:pPr>
@@ -223,8 +244,9 @@
               <w:rPr>
                 <w:b/>
                 <w:bCs/>
-                <w:sz w:val="20"/>
-                <w:szCs w:val="20"/>
+                <w:color w:val="C8102E"/>
+                <w:sz w:val="22"/>
+                <w:szCs w:val="22"/>
               </w:rPr>
               <w:t xml:space="preserve">I. PERSONNEL SERVICES</w:t>
             </w:r>
@@ -576,135 +598,64 @@
       <w:tr>
         <w:tc>
           <w:tcPr>
-            <w:gridSpan w:val="7"/>
-            <w:shd w:fill="FFF2CC"/>
+            <w:gridSpan w:val="6"/>
+            <w:shd w:fill="F7F7F7"/>
           </w:tcPr>
           <w:p>
             <w:pPr>
-              <w:jc w:val="left"/>
+              <w:jc w:val="right"/>
             </w:pPr>
             <w:r>
               <w:rPr>
                 <w:b/>
                 <w:bCs/>
-                <w:sz w:val="20"/>
-                <w:szCs w:val="20"/>
-              </w:rPr>
-              <w:t xml:space="preserve">II. MAINTENANCE &amp; OTHER OPERATING EXPENSES</w:t>
+                <w:color w:val="4A5568"/>
+                <w:sz w:val="20"/>
+                <w:szCs w:val="20"/>
+              </w:rPr>
+              <w:t xml:space="preserve">Subtotal — Personnel Services</w:t>
+            </w:r>
+          </w:p>
+        </w:tc>
+        <w:tc>
+          <w:tcPr>
+            <w:shd w:fill="F7F7F7"/>
+          </w:tcPr>
+          <w:p>
+            <w:pPr>
+              <w:jc w:val="right"/>
+            </w:pPr>
+            <w:r>
+              <w:rPr>
+                <w:b/>
+                <w:bCs/>
+                <w:sz w:val="20"/>
+                <w:szCs w:val="20"/>
+              </w:rPr>
+              <w:t xml:space="preserve">82000</w:t>
             </w:r>
           </w:p>
         </w:tc>
       </w:tr>
       <w:tr>
         <w:tc>
-          <w:p>
-            <w:pPr>
-              <w:jc w:val="left"/>
-            </w:pPr>
-            <w:r>
-              <w:rPr>
-                <w:b w:val="false"/>
-                <w:bCs w:val="false"/>
-                <w:sz w:val="20"/>
-                <w:szCs w:val="20"/>
-              </w:rPr>
-              <w:t xml:space="preserve">Office Supplies</w:t>
-            </w:r>
-          </w:p>
-        </w:tc>
-        <w:tc>
-          <w:p>
-            <w:pPr>
-              <w:jc w:val="left"/>
-            </w:pPr>
-            <w:r>
-              <w:rPr>
-                <w:b w:val="false"/>
-                <w:bCs w:val="false"/>
-                <w:sz w:val="20"/>
-                <w:szCs w:val="20"/>
-              </w:rPr>
-              <w:t xml:space="preserve">Bond Paper</w:t>
-            </w:r>
-          </w:p>
-        </w:tc>
-        <w:tc>
-          <w:p>
-            <w:pPr>
-              <w:jc w:val="left"/>
-            </w:pPr>
-            <w:r>
-              <w:rPr>
-                <w:b w:val="false"/>
-                <w:bCs w:val="false"/>
-                <w:sz w:val="20"/>
-                <w:szCs w:val="20"/>
-              </w:rPr>
-              <w:t xml:space="preserve">80GSM, A4</w:t>
-            </w:r>
-          </w:p>
-        </w:tc>
-        <w:tc>
-          <w:p>
-            <w:pPr>
-              <w:jc w:val="center"/>
-            </w:pPr>
-            <w:r>
-              <w:rPr>
-                <w:b w:val="false"/>
-                <w:bCs w:val="false"/>
-                <w:sz w:val="20"/>
-                <w:szCs w:val="20"/>
-              </w:rPr>
-              <w:t xml:space="preserve">10</w:t>
-            </w:r>
-          </w:p>
-        </w:tc>
-        <w:tc>
-          <w:p>
-            <w:pPr>
-              <w:jc w:val="center"/>
-            </w:pPr>
-            <w:r>
-              <w:rPr>
-                <w:b w:val="false"/>
-                <w:bCs w:val="false"/>
-                <w:sz w:val="20"/>
-                <w:szCs w:val="20"/>
-              </w:rPr>
-              <w:t xml:space="preserve">Ream</w:t>
-            </w:r>
-          </w:p>
-        </w:tc>
-        <w:tc>
-          <w:p>
-            <w:pPr>
-              <w:jc w:val="right"/>
-            </w:pPr>
-            <w:r>
-              <w:rPr>
-                <w:b w:val="false"/>
-                <w:bCs w:val="false"/>
-                <w:sz w:val="20"/>
-                <w:szCs w:val="20"/>
-              </w:rPr>
-              <w:t xml:space="preserve">260</w:t>
-            </w:r>
-          </w:p>
-        </w:tc>
-        <w:tc>
-          <w:p>
-            <w:pPr>
-              <w:jc w:val="right"/>
-            </w:pPr>
-            <w:r>
-              <w:rPr>
-                <w:b w:val="false"/>
-                <w:bCs w:val="false"/>
-                <w:sz w:val="20"/>
-                <w:szCs w:val="20"/>
-              </w:rPr>
-              <w:t xml:space="preserve">2600</w:t>
+          <w:tcPr>
+            <w:gridSpan w:val="7"/>
+            <w:shd w:fill="FDECEE"/>
+          </w:tcPr>
+          <w:p>
+            <w:pPr>
+              <w:jc w:val="left"/>
+            </w:pPr>
+            <w:r>
+              <w:rPr>
+                <w:b/>
+                <w:bCs/>
+                <w:color w:val="C8102E"/>
+                <w:sz w:val="22"/>
+                <w:szCs w:val="22"/>
+              </w:rPr>
+              <w:t xml:space="preserve">II. MAINTENANCE &amp; OTHER OPERATING EXPENSES</w:t>
             </w:r>
           </w:p>
         </w:tc>
@@ -738,87 +689,87 @@
                 <w:sz w:val="20"/>
                 <w:szCs w:val="20"/>
               </w:rPr>
-              <w:t xml:space="preserve">Ballpen</w:t>
-            </w:r>
-          </w:p>
-        </w:tc>
-        <w:tc>
-          <w:p>
-            <w:pPr>
-              <w:jc w:val="left"/>
-            </w:pPr>
-            <w:r>
-              <w:rPr>
-                <w:b w:val="false"/>
-                <w:bCs w:val="false"/>
-                <w:sz w:val="20"/>
-                <w:szCs w:val="20"/>
-              </w:rPr>
-              <w:t xml:space="preserve">Black, 12 pcs/box</w:t>
-            </w:r>
-          </w:p>
-        </w:tc>
-        <w:tc>
-          <w:p>
-            <w:pPr>
-              <w:jc w:val="center"/>
-            </w:pPr>
-            <w:r>
-              <w:rPr>
-                <w:b w:val="false"/>
-                <w:bCs w:val="false"/>
-                <w:sz w:val="20"/>
-                <w:szCs w:val="20"/>
-              </w:rPr>
-              <w:t xml:space="preserve">2</w:t>
-            </w:r>
-          </w:p>
-        </w:tc>
-        <w:tc>
-          <w:p>
-            <w:pPr>
-              <w:jc w:val="center"/>
-            </w:pPr>
-            <w:r>
-              <w:rPr>
-                <w:b w:val="false"/>
-                <w:bCs w:val="false"/>
-                <w:sz w:val="20"/>
-                <w:szCs w:val="20"/>
-              </w:rPr>
-              <w:t xml:space="preserve">Box</w:t>
-            </w:r>
-          </w:p>
-        </w:tc>
-        <w:tc>
-          <w:p>
-            <w:pPr>
-              <w:jc w:val="right"/>
-            </w:pPr>
-            <w:r>
-              <w:rPr>
-                <w:b w:val="false"/>
-                <w:bCs w:val="false"/>
-                <w:sz w:val="20"/>
-                <w:szCs w:val="20"/>
-              </w:rPr>
-              <w:t xml:space="preserve">132</w:t>
-            </w:r>
-          </w:p>
-        </w:tc>
-        <w:tc>
-          <w:p>
-            <w:pPr>
-              <w:jc w:val="right"/>
-            </w:pPr>
-            <w:r>
-              <w:rPr>
-                <w:b w:val="false"/>
-                <w:bCs w:val="false"/>
-                <w:sz w:val="20"/>
-                <w:szCs w:val="20"/>
-              </w:rPr>
-              <w:t xml:space="preserve">264</w:t>
+              <w:t xml:space="preserve">Bond Paper</w:t>
+            </w:r>
+          </w:p>
+        </w:tc>
+        <w:tc>
+          <w:p>
+            <w:pPr>
+              <w:jc w:val="left"/>
+            </w:pPr>
+            <w:r>
+              <w:rPr>
+                <w:b w:val="false"/>
+                <w:bCs w:val="false"/>
+                <w:sz w:val="20"/>
+                <w:szCs w:val="20"/>
+              </w:rPr>
+              <w:t xml:space="preserve">80GSM, A4</w:t>
+            </w:r>
+          </w:p>
+        </w:tc>
+        <w:tc>
+          <w:p>
+            <w:pPr>
+              <w:jc w:val="center"/>
+            </w:pPr>
+            <w:r>
+              <w:rPr>
+                <w:b w:val="false"/>
+                <w:bCs w:val="false"/>
+                <w:sz w:val="20"/>
+                <w:szCs w:val="20"/>
+              </w:rPr>
+              <w:t xml:space="preserve">10</w:t>
+            </w:r>
+          </w:p>
+        </w:tc>
+        <w:tc>
+          <w:p>
+            <w:pPr>
+              <w:jc w:val="center"/>
+            </w:pPr>
+            <w:r>
+              <w:rPr>
+                <w:b w:val="false"/>
+                <w:bCs w:val="false"/>
+                <w:sz w:val="20"/>
+                <w:szCs w:val="20"/>
+              </w:rPr>
+              <w:t xml:space="preserve">Ream</w:t>
+            </w:r>
+          </w:p>
+        </w:tc>
+        <w:tc>
+          <w:p>
+            <w:pPr>
+              <w:jc w:val="right"/>
+            </w:pPr>
+            <w:r>
+              <w:rPr>
+                <w:b w:val="false"/>
+                <w:bCs w:val="false"/>
+                <w:sz w:val="20"/>
+                <w:szCs w:val="20"/>
+              </w:rPr>
+              <w:t xml:space="preserve">260</w:t>
+            </w:r>
+          </w:p>
+        </w:tc>
+        <w:tc>
+          <w:p>
+            <w:pPr>
+              <w:jc w:val="right"/>
+            </w:pPr>
+            <w:r>
+              <w:rPr>
+                <w:b w:val="false"/>
+                <w:bCs w:val="false"/>
+                <w:sz w:val="20"/>
+                <w:szCs w:val="20"/>
+              </w:rPr>
+              <w:t xml:space="preserve">2600</w:t>
             </w:r>
           </w:p>
         </w:tc>
@@ -852,87 +803,87 @@
                 <w:sz w:val="20"/>
                 <w:szCs w:val="20"/>
               </w:rPr>
-              <w:t xml:space="preserve">Folder</w:t>
-            </w:r>
-          </w:p>
-        </w:tc>
-        <w:tc>
-          <w:p>
-            <w:pPr>
-              <w:jc w:val="left"/>
-            </w:pPr>
-            <w:r>
-              <w:rPr>
-                <w:b w:val="false"/>
-                <w:bCs w:val="false"/>
-                <w:sz w:val="20"/>
-                <w:szCs w:val="20"/>
-              </w:rPr>
-              <w:t xml:space="preserve">Ordinary, Long, Tagboard</w:t>
-            </w:r>
-          </w:p>
-        </w:tc>
-        <w:tc>
-          <w:p>
-            <w:pPr>
-              <w:jc w:val="center"/>
-            </w:pPr>
-            <w:r>
-              <w:rPr>
-                <w:b w:val="false"/>
-                <w:bCs w:val="false"/>
-                <w:sz w:val="20"/>
-                <w:szCs w:val="20"/>
-              </w:rPr>
-              <w:t xml:space="preserve">20</w:t>
-            </w:r>
-          </w:p>
-        </w:tc>
-        <w:tc>
-          <w:p>
-            <w:pPr>
-              <w:jc w:val="center"/>
-            </w:pPr>
-            <w:r>
-              <w:rPr>
-                <w:b w:val="false"/>
-                <w:bCs w:val="false"/>
-                <w:sz w:val="20"/>
-                <w:szCs w:val="20"/>
-              </w:rPr>
-              <w:t xml:space="preserve">Piece</w:t>
-            </w:r>
-          </w:p>
-        </w:tc>
-        <w:tc>
-          <w:p>
-            <w:pPr>
-              <w:jc w:val="right"/>
-            </w:pPr>
-            <w:r>
-              <w:rPr>
-                <w:b w:val="false"/>
-                <w:bCs w:val="false"/>
-                <w:sz w:val="20"/>
-                <w:szCs w:val="20"/>
-              </w:rPr>
-              <w:t xml:space="preserve">5</w:t>
-            </w:r>
-          </w:p>
-        </w:tc>
-        <w:tc>
-          <w:p>
-            <w:pPr>
-              <w:jc w:val="right"/>
-            </w:pPr>
-            <w:r>
-              <w:rPr>
-                <w:b w:val="false"/>
-                <w:bCs w:val="false"/>
-                <w:sz w:val="20"/>
-                <w:szCs w:val="20"/>
-              </w:rPr>
-              <w:t xml:space="preserve">100</w:t>
+              <w:t xml:space="preserve">Ballpen</w:t>
+            </w:r>
+          </w:p>
+        </w:tc>
+        <w:tc>
+          <w:p>
+            <w:pPr>
+              <w:jc w:val="left"/>
+            </w:pPr>
+            <w:r>
+              <w:rPr>
+                <w:b w:val="false"/>
+                <w:bCs w:val="false"/>
+                <w:sz w:val="20"/>
+                <w:szCs w:val="20"/>
+              </w:rPr>
+              <w:t xml:space="preserve">Black, 12 pcs/box</w:t>
+            </w:r>
+          </w:p>
+        </w:tc>
+        <w:tc>
+          <w:p>
+            <w:pPr>
+              <w:jc w:val="center"/>
+            </w:pPr>
+            <w:r>
+              <w:rPr>
+                <w:b w:val="false"/>
+                <w:bCs w:val="false"/>
+                <w:sz w:val="20"/>
+                <w:szCs w:val="20"/>
+              </w:rPr>
+              <w:t xml:space="preserve">2</w:t>
+            </w:r>
+          </w:p>
+        </w:tc>
+        <w:tc>
+          <w:p>
+            <w:pPr>
+              <w:jc w:val="center"/>
+            </w:pPr>
+            <w:r>
+              <w:rPr>
+                <w:b w:val="false"/>
+                <w:bCs w:val="false"/>
+                <w:sz w:val="20"/>
+                <w:szCs w:val="20"/>
+              </w:rPr>
+              <w:t xml:space="preserve">Box</w:t>
+            </w:r>
+          </w:p>
+        </w:tc>
+        <w:tc>
+          <w:p>
+            <w:pPr>
+              <w:jc w:val="right"/>
+            </w:pPr>
+            <w:r>
+              <w:rPr>
+                <w:b w:val="false"/>
+                <w:bCs w:val="false"/>
+                <w:sz w:val="20"/>
+                <w:szCs w:val="20"/>
+              </w:rPr>
+              <w:t xml:space="preserve">132</w:t>
+            </w:r>
+          </w:p>
+        </w:tc>
+        <w:tc>
+          <w:p>
+            <w:pPr>
+              <w:jc w:val="right"/>
+            </w:pPr>
+            <w:r>
+              <w:rPr>
+                <w:b w:val="false"/>
+                <w:bCs w:val="false"/>
+                <w:sz w:val="20"/>
+                <w:szCs w:val="20"/>
+              </w:rPr>
+              <w:t xml:space="preserve">264</w:t>
             </w:r>
           </w:p>
         </w:tc>
@@ -950,39 +901,39 @@
                 <w:sz w:val="20"/>
                 <w:szCs w:val="20"/>
               </w:rPr>
-              <w:t xml:space="preserve">Communication Expenses</w:t>
-            </w:r>
-          </w:p>
-        </w:tc>
-        <w:tc>
-          <w:p>
-            <w:pPr>
-              <w:jc w:val="left"/>
-            </w:pPr>
-            <w:r>
-              <w:rPr>
-                <w:b w:val="false"/>
-                <w:bCs w:val="false"/>
-                <w:sz w:val="20"/>
-                <w:szCs w:val="20"/>
-              </w:rPr>
-              <w:t xml:space="preserve">Mobile Load</w:t>
-            </w:r>
-          </w:p>
-        </w:tc>
-        <w:tc>
-          <w:p>
-            <w:pPr>
-              <w:jc w:val="left"/>
-            </w:pPr>
-            <w:r>
-              <w:rPr>
-                <w:b w:val="false"/>
-                <w:bCs w:val="false"/>
-                <w:sz w:val="20"/>
-                <w:szCs w:val="20"/>
-              </w:rPr>
-              <w:t xml:space="preserve">Php 500 denomination</w:t>
+              <w:t xml:space="preserve">Office Supplies</w:t>
+            </w:r>
+          </w:p>
+        </w:tc>
+        <w:tc>
+          <w:p>
+            <w:pPr>
+              <w:jc w:val="left"/>
+            </w:pPr>
+            <w:r>
+              <w:rPr>
+                <w:b w:val="false"/>
+                <w:bCs w:val="false"/>
+                <w:sz w:val="20"/>
+                <w:szCs w:val="20"/>
+              </w:rPr>
+              <w:t xml:space="preserve">Folder</w:t>
+            </w:r>
+          </w:p>
+        </w:tc>
+        <w:tc>
+          <w:p>
+            <w:pPr>
+              <w:jc w:val="left"/>
+            </w:pPr>
+            <w:r>
+              <w:rPr>
+                <w:b w:val="false"/>
+                <w:bCs w:val="false"/>
+                <w:sz w:val="20"/>
+                <w:szCs w:val="20"/>
+              </w:rPr>
+              <w:t xml:space="preserve">Ordinary, Long, Tagboard</w:t>
             </w:r>
           </w:p>
         </w:tc>
@@ -1030,23 +981,23 @@
                 <w:sz w:val="20"/>
                 <w:szCs w:val="20"/>
               </w:rPr>
-              <w:t xml:space="preserve">500</w:t>
-            </w:r>
-          </w:p>
-        </w:tc>
-        <w:tc>
-          <w:p>
-            <w:pPr>
-              <w:jc w:val="right"/>
-            </w:pPr>
-            <w:r>
-              <w:rPr>
-                <w:b w:val="false"/>
-                <w:bCs w:val="false"/>
-                <w:sz w:val="20"/>
-                <w:szCs w:val="20"/>
-              </w:rPr>
-              <w:t xml:space="preserve">10000</w:t>
+              <w:t xml:space="preserve">5</w:t>
+            </w:r>
+          </w:p>
+        </w:tc>
+        <w:tc>
+          <w:p>
+            <w:pPr>
+              <w:jc w:val="right"/>
+            </w:pPr>
+            <w:r>
+              <w:rPr>
+                <w:b w:val="false"/>
+                <w:bCs w:val="false"/>
+                <w:sz w:val="20"/>
+                <w:szCs w:val="20"/>
+              </w:rPr>
+              <w:t xml:space="preserve">100</w:t>
             </w:r>
           </w:p>
         </w:tc>
@@ -1080,87 +1031,87 @@
                 <w:sz w:val="20"/>
                 <w:szCs w:val="20"/>
               </w:rPr>
-              <w:t xml:space="preserve">Internet Subscription</w:t>
-            </w:r>
-          </w:p>
-        </w:tc>
-        <w:tc>
-          <w:p>
-            <w:pPr>
-              <w:jc w:val="left"/>
-            </w:pPr>
-            <w:r>
-              <w:rPr>
-                <w:b w:val="false"/>
-                <w:bCs w:val="false"/>
-                <w:sz w:val="20"/>
-                <w:szCs w:val="20"/>
-              </w:rPr>
-              <w:t xml:space="preserve">Monthly fiber plan</w:t>
-            </w:r>
-          </w:p>
-        </w:tc>
-        <w:tc>
-          <w:p>
-            <w:pPr>
-              <w:jc w:val="center"/>
-            </w:pPr>
-            <w:r>
-              <w:rPr>
-                <w:b w:val="false"/>
-                <w:bCs w:val="false"/>
-                <w:sz w:val="20"/>
-                <w:szCs w:val="20"/>
-              </w:rPr>
-              <w:t xml:space="preserve">6</w:t>
-            </w:r>
-          </w:p>
-        </w:tc>
-        <w:tc>
-          <w:p>
-            <w:pPr>
-              <w:jc w:val="center"/>
-            </w:pPr>
-            <w:r>
-              <w:rPr>
-                <w:b w:val="false"/>
-                <w:bCs w:val="false"/>
-                <w:sz w:val="20"/>
-                <w:szCs w:val="20"/>
-              </w:rPr>
-              <w:t xml:space="preserve">Month</w:t>
-            </w:r>
-          </w:p>
-        </w:tc>
-        <w:tc>
-          <w:p>
-            <w:pPr>
-              <w:jc w:val="right"/>
-            </w:pPr>
-            <w:r>
-              <w:rPr>
-                <w:b w:val="false"/>
-                <w:bCs w:val="false"/>
-                <w:sz w:val="20"/>
-                <w:szCs w:val="20"/>
-              </w:rPr>
-              <w:t xml:space="preserve">1500</w:t>
-            </w:r>
-          </w:p>
-        </w:tc>
-        <w:tc>
-          <w:p>
-            <w:pPr>
-              <w:jc w:val="right"/>
-            </w:pPr>
-            <w:r>
-              <w:rPr>
-                <w:b w:val="false"/>
-                <w:bCs w:val="false"/>
-                <w:sz w:val="20"/>
-                <w:szCs w:val="20"/>
-              </w:rPr>
-              <w:t xml:space="preserve">9000</w:t>
+              <w:t xml:space="preserve">Mobile Load</w:t>
+            </w:r>
+          </w:p>
+        </w:tc>
+        <w:tc>
+          <w:p>
+            <w:pPr>
+              <w:jc w:val="left"/>
+            </w:pPr>
+            <w:r>
+              <w:rPr>
+                <w:b w:val="false"/>
+                <w:bCs w:val="false"/>
+                <w:sz w:val="20"/>
+                <w:szCs w:val="20"/>
+              </w:rPr>
+              <w:t xml:space="preserve">Php 500 denomination</w:t>
+            </w:r>
+          </w:p>
+        </w:tc>
+        <w:tc>
+          <w:p>
+            <w:pPr>
+              <w:jc w:val="center"/>
+            </w:pPr>
+            <w:r>
+              <w:rPr>
+                <w:b w:val="false"/>
+                <w:bCs w:val="false"/>
+                <w:sz w:val="20"/>
+                <w:szCs w:val="20"/>
+              </w:rPr>
+              <w:t xml:space="preserve">20</w:t>
+            </w:r>
+          </w:p>
+        </w:tc>
+        <w:tc>
+          <w:p>
+            <w:pPr>
+              <w:jc w:val="center"/>
+            </w:pPr>
+            <w:r>
+              <w:rPr>
+                <w:b w:val="false"/>
+                <w:bCs w:val="false"/>
+                <w:sz w:val="20"/>
+                <w:szCs w:val="20"/>
+              </w:rPr>
+              <w:t xml:space="preserve">Piece</w:t>
+            </w:r>
+          </w:p>
+        </w:tc>
+        <w:tc>
+          <w:p>
+            <w:pPr>
+              <w:jc w:val="right"/>
+            </w:pPr>
+            <w:r>
+              <w:rPr>
+                <w:b w:val="false"/>
+                <w:bCs w:val="false"/>
+                <w:sz w:val="20"/>
+                <w:szCs w:val="20"/>
+              </w:rPr>
+              <w:t xml:space="preserve">500</w:t>
+            </w:r>
+          </w:p>
+        </w:tc>
+        <w:tc>
+          <w:p>
+            <w:pPr>
+              <w:jc w:val="right"/>
+            </w:pPr>
+            <w:r>
+              <w:rPr>
+                <w:b w:val="false"/>
+                <w:bCs w:val="false"/>
+                <w:sz w:val="20"/>
+                <w:szCs w:val="20"/>
+              </w:rPr>
+              <w:t xml:space="preserve">10000</w:t>
             </w:r>
           </w:p>
         </w:tc>
@@ -1178,103 +1129,103 @@
                 <w:sz w:val="20"/>
                 <w:szCs w:val="20"/>
               </w:rPr>
-              <w:t xml:space="preserve">Electronic Parts and Components</w:t>
-            </w:r>
-          </w:p>
-        </w:tc>
-        <w:tc>
-          <w:p>
-            <w:pPr>
-              <w:jc w:val="left"/>
-            </w:pPr>
-            <w:r>
-              <w:rPr>
-                <w:b w:val="false"/>
-                <w:bCs w:val="false"/>
-                <w:sz w:val="20"/>
-                <w:szCs w:val="20"/>
-              </w:rPr>
-              <w:t xml:space="preserve">Arduino Uno R3</w:t>
-            </w:r>
-          </w:p>
-        </w:tc>
-        <w:tc>
-          <w:p>
-            <w:pPr>
-              <w:jc w:val="left"/>
-            </w:pPr>
-            <w:r>
-              <w:rPr>
-                <w:b w:val="false"/>
-                <w:bCs w:val="false"/>
-                <w:sz w:val="20"/>
-                <w:szCs w:val="20"/>
-              </w:rPr>
-              <w:t xml:space="preserve">Atmega328</w:t>
-            </w:r>
-          </w:p>
-        </w:tc>
-        <w:tc>
-          <w:p>
-            <w:pPr>
-              <w:jc w:val="center"/>
-            </w:pPr>
-            <w:r>
-              <w:rPr>
-                <w:b w:val="false"/>
-                <w:bCs w:val="false"/>
-                <w:sz w:val="20"/>
-                <w:szCs w:val="20"/>
-              </w:rPr>
-              <w:t xml:space="preserve">12</w:t>
-            </w:r>
-          </w:p>
-        </w:tc>
-        <w:tc>
-          <w:p>
-            <w:pPr>
-              <w:jc w:val="center"/>
-            </w:pPr>
-            <w:r>
-              <w:rPr>
-                <w:b w:val="false"/>
-                <w:bCs w:val="false"/>
-                <w:sz w:val="20"/>
-                <w:szCs w:val="20"/>
-              </w:rPr>
-              <w:t xml:space="preserve">Piece</w:t>
-            </w:r>
-          </w:p>
-        </w:tc>
-        <w:tc>
-          <w:p>
-            <w:pPr>
-              <w:jc w:val="right"/>
-            </w:pPr>
-            <w:r>
-              <w:rPr>
-                <w:b w:val="false"/>
-                <w:bCs w:val="false"/>
-                <w:sz w:val="20"/>
-                <w:szCs w:val="20"/>
-              </w:rPr>
-              <w:t xml:space="preserve">600</w:t>
-            </w:r>
-          </w:p>
-        </w:tc>
-        <w:tc>
-          <w:p>
-            <w:pPr>
-              <w:jc w:val="right"/>
-            </w:pPr>
-            <w:r>
-              <w:rPr>
-                <w:b w:val="false"/>
-                <w:bCs w:val="false"/>
-                <w:sz w:val="20"/>
-                <w:szCs w:val="20"/>
-              </w:rPr>
-              <w:t xml:space="preserve">7200</w:t>
+              <w:t xml:space="preserve">Communication Expenses</w:t>
+            </w:r>
+          </w:p>
+        </w:tc>
+        <w:tc>
+          <w:p>
+            <w:pPr>
+              <w:jc w:val="left"/>
+            </w:pPr>
+            <w:r>
+              <w:rPr>
+                <w:b w:val="false"/>
+                <w:bCs w:val="false"/>
+                <w:sz w:val="20"/>
+                <w:szCs w:val="20"/>
+              </w:rPr>
+              <w:t xml:space="preserve">Internet Subscription</w:t>
+            </w:r>
+          </w:p>
+        </w:tc>
+        <w:tc>
+          <w:p>
+            <w:pPr>
+              <w:jc w:val="left"/>
+            </w:pPr>
+            <w:r>
+              <w:rPr>
+                <w:b w:val="false"/>
+                <w:bCs w:val="false"/>
+                <w:sz w:val="20"/>
+                <w:szCs w:val="20"/>
+              </w:rPr>
+              <w:t xml:space="preserve">Monthly fiber plan</w:t>
+            </w:r>
+          </w:p>
+        </w:tc>
+        <w:tc>
+          <w:p>
+            <w:pPr>
+              <w:jc w:val="center"/>
+            </w:pPr>
+            <w:r>
+              <w:rPr>
+                <w:b w:val="false"/>
+                <w:bCs w:val="false"/>
+                <w:sz w:val="20"/>
+                <w:szCs w:val="20"/>
+              </w:rPr>
+              <w:t xml:space="preserve">6</w:t>
+            </w:r>
+          </w:p>
+        </w:tc>
+        <w:tc>
+          <w:p>
+            <w:pPr>
+              <w:jc w:val="center"/>
+            </w:pPr>
+            <w:r>
+              <w:rPr>
+                <w:b w:val="false"/>
+                <w:bCs w:val="false"/>
+                <w:sz w:val="20"/>
+                <w:szCs w:val="20"/>
+              </w:rPr>
+              <w:t xml:space="preserve">Month</w:t>
+            </w:r>
+          </w:p>
+        </w:tc>
+        <w:tc>
+          <w:p>
+            <w:pPr>
+              <w:jc w:val="right"/>
+            </w:pPr>
+            <w:r>
+              <w:rPr>
+                <w:b w:val="false"/>
+                <w:bCs w:val="false"/>
+                <w:sz w:val="20"/>
+                <w:szCs w:val="20"/>
+              </w:rPr>
+              <w:t xml:space="preserve">1500</w:t>
+            </w:r>
+          </w:p>
+        </w:tc>
+        <w:tc>
+          <w:p>
+            <w:pPr>
+              <w:jc w:val="right"/>
+            </w:pPr>
+            <w:r>
+              <w:rPr>
+                <w:b w:val="false"/>
+                <w:bCs w:val="false"/>
+                <w:sz w:val="20"/>
+                <w:szCs w:val="20"/>
+              </w:rPr>
+              <w:t xml:space="preserve">9000</w:t>
             </w:r>
           </w:p>
         </w:tc>
@@ -1308,23 +1259,23 @@
                 <w:sz w:val="20"/>
                 <w:szCs w:val="20"/>
               </w:rPr>
-              <w:t xml:space="preserve">DHT22 Sensor Module</w:t>
-            </w:r>
-          </w:p>
-        </w:tc>
-        <w:tc>
-          <w:p>
-            <w:pPr>
-              <w:jc w:val="left"/>
-            </w:pPr>
-            <w:r>
-              <w:rPr>
-                <w:b w:val="false"/>
-                <w:bCs w:val="false"/>
-                <w:sz w:val="20"/>
-                <w:szCs w:val="20"/>
-              </w:rPr>
-              <w:t xml:space="preserve">5V, temp + humidity</w:t>
+              <w:t xml:space="preserve">Arduino Uno R3</w:t>
+            </w:r>
+          </w:p>
+        </w:tc>
+        <w:tc>
+          <w:p>
+            <w:pPr>
+              <w:jc w:val="left"/>
+            </w:pPr>
+            <w:r>
+              <w:rPr>
+                <w:b w:val="false"/>
+                <w:bCs w:val="false"/>
+                <w:sz w:val="20"/>
+                <w:szCs w:val="20"/>
+              </w:rPr>
+              <w:t xml:space="preserve">Atmega328</w:t>
             </w:r>
           </w:p>
         </w:tc>
@@ -1356,7 +1307,7 @@
                 <w:sz w:val="20"/>
                 <w:szCs w:val="20"/>
               </w:rPr>
-              <w:t xml:space="preserve">Unit</w:t>
+              <w:t xml:space="preserve">Piece</w:t>
             </w:r>
           </w:p>
         </w:tc>
@@ -1406,103 +1357,103 @@
                 <w:sz w:val="20"/>
                 <w:szCs w:val="20"/>
               </w:rPr>
-              <w:t xml:space="preserve">Laboratory Supplies</w:t>
-            </w:r>
-          </w:p>
-        </w:tc>
-        <w:tc>
-          <w:p>
-            <w:pPr>
-              <w:jc w:val="left"/>
-            </w:pPr>
-            <w:r>
-              <w:rPr>
-                <w:b w:val="false"/>
-                <w:bCs w:val="false"/>
-                <w:sz w:val="20"/>
-                <w:szCs w:val="20"/>
-              </w:rPr>
-              <w:t xml:space="preserve">Alcohol 70% Isopropyl</w:t>
-            </w:r>
-          </w:p>
-        </w:tc>
-        <w:tc>
-          <w:p>
-            <w:pPr>
-              <w:jc w:val="left"/>
-            </w:pPr>
-            <w:r>
-              <w:rPr>
-                <w:b w:val="false"/>
-                <w:bCs w:val="false"/>
-                <w:sz w:val="20"/>
-                <w:szCs w:val="20"/>
-              </w:rPr>
-              <w:t xml:space="preserve">Disinfectant</w:t>
-            </w:r>
-          </w:p>
-        </w:tc>
-        <w:tc>
-          <w:p>
-            <w:pPr>
-              <w:jc w:val="center"/>
-            </w:pPr>
-            <w:r>
-              <w:rPr>
-                <w:b w:val="false"/>
-                <w:bCs w:val="false"/>
-                <w:sz w:val="20"/>
-                <w:szCs w:val="20"/>
-              </w:rPr>
-              <w:t xml:space="preserve">2</w:t>
-            </w:r>
-          </w:p>
-        </w:tc>
-        <w:tc>
-          <w:p>
-            <w:pPr>
-              <w:jc w:val="center"/>
-            </w:pPr>
-            <w:r>
-              <w:rPr>
-                <w:b w:val="false"/>
-                <w:bCs w:val="false"/>
-                <w:sz w:val="20"/>
-                <w:szCs w:val="20"/>
-              </w:rPr>
-              <w:t xml:space="preserve">Gallon</w:t>
-            </w:r>
-          </w:p>
-        </w:tc>
-        <w:tc>
-          <w:p>
-            <w:pPr>
-              <w:jc w:val="right"/>
-            </w:pPr>
-            <w:r>
-              <w:rPr>
-                <w:b w:val="false"/>
-                <w:bCs w:val="false"/>
-                <w:sz w:val="20"/>
-                <w:szCs w:val="20"/>
-              </w:rPr>
-              <w:t xml:space="preserve">800</w:t>
-            </w:r>
-          </w:p>
-        </w:tc>
-        <w:tc>
-          <w:p>
-            <w:pPr>
-              <w:jc w:val="right"/>
-            </w:pPr>
-            <w:r>
-              <w:rPr>
-                <w:b w:val="false"/>
-                <w:bCs w:val="false"/>
-                <w:sz w:val="20"/>
-                <w:szCs w:val="20"/>
-              </w:rPr>
-              <w:t xml:space="preserve">1600</w:t>
+              <w:t xml:space="preserve">Electronic Parts and Components</w:t>
+            </w:r>
+          </w:p>
+        </w:tc>
+        <w:tc>
+          <w:p>
+            <w:pPr>
+              <w:jc w:val="left"/>
+            </w:pPr>
+            <w:r>
+              <w:rPr>
+                <w:b w:val="false"/>
+                <w:bCs w:val="false"/>
+                <w:sz w:val="20"/>
+                <w:szCs w:val="20"/>
+              </w:rPr>
+              <w:t xml:space="preserve">DHT22 Sensor Module</w:t>
+            </w:r>
+          </w:p>
+        </w:tc>
+        <w:tc>
+          <w:p>
+            <w:pPr>
+              <w:jc w:val="left"/>
+            </w:pPr>
+            <w:r>
+              <w:rPr>
+                <w:b w:val="false"/>
+                <w:bCs w:val="false"/>
+                <w:sz w:val="20"/>
+                <w:szCs w:val="20"/>
+              </w:rPr>
+              <w:t xml:space="preserve">5V, temp + humidity</w:t>
+            </w:r>
+          </w:p>
+        </w:tc>
+        <w:tc>
+          <w:p>
+            <w:pPr>
+              <w:jc w:val="center"/>
+            </w:pPr>
+            <w:r>
+              <w:rPr>
+                <w:b w:val="false"/>
+                <w:bCs w:val="false"/>
+                <w:sz w:val="20"/>
+                <w:szCs w:val="20"/>
+              </w:rPr>
+              <w:t xml:space="preserve">12</w:t>
+            </w:r>
+          </w:p>
+        </w:tc>
+        <w:tc>
+          <w:p>
+            <w:pPr>
+              <w:jc w:val="center"/>
+            </w:pPr>
+            <w:r>
+              <w:rPr>
+                <w:b w:val="false"/>
+                <w:bCs w:val="false"/>
+                <w:sz w:val="20"/>
+                <w:szCs w:val="20"/>
+              </w:rPr>
+              <w:t xml:space="preserve">Unit</w:t>
+            </w:r>
+          </w:p>
+        </w:tc>
+        <w:tc>
+          <w:p>
+            <w:pPr>
+              <w:jc w:val="right"/>
+            </w:pPr>
+            <w:r>
+              <w:rPr>
+                <w:b w:val="false"/>
+                <w:bCs w:val="false"/>
+                <w:sz w:val="20"/>
+                <w:szCs w:val="20"/>
+              </w:rPr>
+              <w:t xml:space="preserve">600</w:t>
+            </w:r>
+          </w:p>
+        </w:tc>
+        <w:tc>
+          <w:p>
+            <w:pPr>
+              <w:jc w:val="right"/>
+            </w:pPr>
+            <w:r>
+              <w:rPr>
+                <w:b w:val="false"/>
+                <w:bCs w:val="false"/>
+                <w:sz w:val="20"/>
+                <w:szCs w:val="20"/>
+              </w:rPr>
+              <w:t xml:space="preserve">7200</w:t>
             </w:r>
           </w:p>
         </w:tc>
@@ -1520,103 +1471,103 @@
                 <w:sz w:val="20"/>
                 <w:szCs w:val="20"/>
               </w:rPr>
-              <w:t xml:space="preserve">Other</w:t>
-            </w:r>
-          </w:p>
-        </w:tc>
-        <w:tc>
-          <w:p>
-            <w:pPr>
-              <w:jc w:val="left"/>
-            </w:pPr>
-            <w:r>
-              <w:rPr>
-                <w:b w:val="false"/>
-                <w:bCs w:val="false"/>
-                <w:sz w:val="20"/>
-                <w:szCs w:val="20"/>
-              </w:rPr>
-              <w:t xml:space="preserve">PM2.5 Optical Dust Sensor</w:t>
-            </w:r>
-          </w:p>
-        </w:tc>
-        <w:tc>
-          <w:p>
-            <w:pPr>
-              <w:jc w:val="left"/>
-            </w:pPr>
-            <w:r>
-              <w:rPr>
-                <w:b w:val="false"/>
-                <w:bCs w:val="false"/>
-                <w:sz w:val="20"/>
-                <w:szCs w:val="20"/>
-              </w:rPr>
-              <w:t xml:space="preserve">GP2Y1010AUOF</w:t>
-            </w:r>
-          </w:p>
-        </w:tc>
-        <w:tc>
-          <w:p>
-            <w:pPr>
-              <w:jc w:val="center"/>
-            </w:pPr>
-            <w:r>
-              <w:rPr>
-                <w:b w:val="false"/>
-                <w:bCs w:val="false"/>
-                <w:sz w:val="20"/>
-                <w:szCs w:val="20"/>
-              </w:rPr>
-              <w:t xml:space="preserve">6</w:t>
-            </w:r>
-          </w:p>
-        </w:tc>
-        <w:tc>
-          <w:p>
-            <w:pPr>
-              <w:jc w:val="center"/>
-            </w:pPr>
-            <w:r>
-              <w:rPr>
-                <w:b w:val="false"/>
-                <w:bCs w:val="false"/>
-                <w:sz w:val="20"/>
-                <w:szCs w:val="20"/>
-              </w:rPr>
-              <w:t xml:space="preserve">Unit</w:t>
-            </w:r>
-          </w:p>
-        </w:tc>
-        <w:tc>
-          <w:p>
-            <w:pPr>
-              <w:jc w:val="right"/>
-            </w:pPr>
-            <w:r>
-              <w:rPr>
-                <w:b w:val="false"/>
-                <w:bCs w:val="false"/>
-                <w:sz w:val="20"/>
-                <w:szCs w:val="20"/>
-              </w:rPr>
-              <w:t xml:space="preserve">900</w:t>
-            </w:r>
-          </w:p>
-        </w:tc>
-        <w:tc>
-          <w:p>
-            <w:pPr>
-              <w:jc w:val="right"/>
-            </w:pPr>
-            <w:r>
-              <w:rPr>
-                <w:b w:val="false"/>
-                <w:bCs w:val="false"/>
-                <w:sz w:val="20"/>
-                <w:szCs w:val="20"/>
-              </w:rPr>
-              <w:t xml:space="preserve">5400</w:t>
+              <w:t xml:space="preserve">Laboratory Supplies</w:t>
+            </w:r>
+          </w:p>
+        </w:tc>
+        <w:tc>
+          <w:p>
+            <w:pPr>
+              <w:jc w:val="left"/>
+            </w:pPr>
+            <w:r>
+              <w:rPr>
+                <w:b w:val="false"/>
+                <w:bCs w:val="false"/>
+                <w:sz w:val="20"/>
+                <w:szCs w:val="20"/>
+              </w:rPr>
+              <w:t xml:space="preserve">Alcohol 70% Isopropyl</w:t>
+            </w:r>
+          </w:p>
+        </w:tc>
+        <w:tc>
+          <w:p>
+            <w:pPr>
+              <w:jc w:val="left"/>
+            </w:pPr>
+            <w:r>
+              <w:rPr>
+                <w:b w:val="false"/>
+                <w:bCs w:val="false"/>
+                <w:sz w:val="20"/>
+                <w:szCs w:val="20"/>
+              </w:rPr>
+              <w:t xml:space="preserve">Disinfectant</w:t>
+            </w:r>
+          </w:p>
+        </w:tc>
+        <w:tc>
+          <w:p>
+            <w:pPr>
+              <w:jc w:val="center"/>
+            </w:pPr>
+            <w:r>
+              <w:rPr>
+                <w:b w:val="false"/>
+                <w:bCs w:val="false"/>
+                <w:sz w:val="20"/>
+                <w:szCs w:val="20"/>
+              </w:rPr>
+              <w:t xml:space="preserve">2</w:t>
+            </w:r>
+          </w:p>
+        </w:tc>
+        <w:tc>
+          <w:p>
+            <w:pPr>
+              <w:jc w:val="center"/>
+            </w:pPr>
+            <w:r>
+              <w:rPr>
+                <w:b w:val="false"/>
+                <w:bCs w:val="false"/>
+                <w:sz w:val="20"/>
+                <w:szCs w:val="20"/>
+              </w:rPr>
+              <w:t xml:space="preserve">Gallon</w:t>
+            </w:r>
+          </w:p>
+        </w:tc>
+        <w:tc>
+          <w:p>
+            <w:pPr>
+              <w:jc w:val="right"/>
+            </w:pPr>
+            <w:r>
+              <w:rPr>
+                <w:b w:val="false"/>
+                <w:bCs w:val="false"/>
+                <w:sz w:val="20"/>
+                <w:szCs w:val="20"/>
+              </w:rPr>
+              <w:t xml:space="preserve">800</w:t>
+            </w:r>
+          </w:p>
+        </w:tc>
+        <w:tc>
+          <w:p>
+            <w:pPr>
+              <w:jc w:val="right"/>
+            </w:pPr>
+            <w:r>
+              <w:rPr>
+                <w:b w:val="false"/>
+                <w:bCs w:val="false"/>
+                <w:sz w:val="20"/>
+                <w:szCs w:val="20"/>
+              </w:rPr>
+              <w:t xml:space="preserve">1600</w:t>
             </w:r>
           </w:p>
         </w:tc>
@@ -1650,96 +1601,252 @@
                 <w:sz w:val="20"/>
                 <w:szCs w:val="20"/>
               </w:rPr>
-              <w:t xml:space="preserve">SGP30 Air Quality Sensor</w:t>
-            </w:r>
-          </w:p>
-        </w:tc>
-        <w:tc>
-          <w:p>
-            <w:pPr>
-              <w:jc w:val="left"/>
-            </w:pPr>
-            <w:r>
-              <w:rPr>
-                <w:b w:val="false"/>
-                <w:bCs w:val="false"/>
-                <w:sz w:val="20"/>
-                <w:szCs w:val="20"/>
-              </w:rPr>
-              <w:t xml:space="preserve">VOC/CO2 breakout board</w:t>
-            </w:r>
-          </w:p>
-        </w:tc>
-        <w:tc>
-          <w:p>
-            <w:pPr>
-              <w:jc w:val="center"/>
-            </w:pPr>
-            <w:r>
-              <w:rPr>
-                <w:b w:val="false"/>
-                <w:bCs w:val="false"/>
-                <w:sz w:val="20"/>
-                <w:szCs w:val="20"/>
-              </w:rPr>
-              <w:t xml:space="preserve">3</w:t>
-            </w:r>
-          </w:p>
-        </w:tc>
-        <w:tc>
-          <w:p>
-            <w:pPr>
-              <w:jc w:val="center"/>
-            </w:pPr>
-            <w:r>
-              <w:rPr>
-                <w:b w:val="false"/>
-                <w:bCs w:val="false"/>
-                <w:sz w:val="20"/>
-                <w:szCs w:val="20"/>
-              </w:rPr>
-              <w:t xml:space="preserve">Piece</w:t>
-            </w:r>
-          </w:p>
-        </w:tc>
-        <w:tc>
-          <w:p>
-            <w:pPr>
-              <w:jc w:val="right"/>
-            </w:pPr>
-            <w:r>
-              <w:rPr>
-                <w:b w:val="false"/>
-                <w:bCs w:val="false"/>
-                <w:sz w:val="20"/>
-                <w:szCs w:val="20"/>
-              </w:rPr>
-              <w:t xml:space="preserve">850</w:t>
-            </w:r>
-          </w:p>
-        </w:tc>
-        <w:tc>
-          <w:p>
-            <w:pPr>
-              <w:jc w:val="right"/>
-            </w:pPr>
-            <w:r>
-              <w:rPr>
-                <w:b w:val="false"/>
-                <w:bCs w:val="false"/>
-                <w:sz w:val="20"/>
-                <w:szCs w:val="20"/>
-              </w:rPr>
-              <w:t xml:space="preserve">2550</w:t>
+              <w:t xml:space="preserve">PM2.5 Optical Dust Sensor</w:t>
+            </w:r>
+          </w:p>
+        </w:tc>
+        <w:tc>
+          <w:p>
+            <w:pPr>
+              <w:jc w:val="left"/>
+            </w:pPr>
+            <w:r>
+              <w:rPr>
+                <w:b w:val="false"/>
+                <w:bCs w:val="false"/>
+                <w:sz w:val="20"/>
+                <w:szCs w:val="20"/>
+              </w:rPr>
+              <w:t xml:space="preserve">GP2Y1010AUOF</w:t>
+            </w:r>
+          </w:p>
+        </w:tc>
+        <w:tc>
+          <w:p>
+            <w:pPr>
+              <w:jc w:val="center"/>
+            </w:pPr>
+            <w:r>
+              <w:rPr>
+                <w:b w:val="false"/>
+                <w:bCs w:val="false"/>
+                <w:sz w:val="20"/>
+                <w:szCs w:val="20"/>
+              </w:rPr>
+              <w:t xml:space="preserve">6</w:t>
+            </w:r>
+          </w:p>
+        </w:tc>
+        <w:tc>
+          <w:p>
+            <w:pPr>
+              <w:jc w:val="center"/>
+            </w:pPr>
+            <w:r>
+              <w:rPr>
+                <w:b w:val="false"/>
+                <w:bCs w:val="false"/>
+                <w:sz w:val="20"/>
+                <w:szCs w:val="20"/>
+              </w:rPr>
+              <w:t xml:space="preserve">Unit</w:t>
+            </w:r>
+          </w:p>
+        </w:tc>
+        <w:tc>
+          <w:p>
+            <w:pPr>
+              <w:jc w:val="right"/>
+            </w:pPr>
+            <w:r>
+              <w:rPr>
+                <w:b w:val="false"/>
+                <w:bCs w:val="false"/>
+                <w:sz w:val="20"/>
+                <w:szCs w:val="20"/>
+              </w:rPr>
+              <w:t xml:space="preserve">900</w:t>
+            </w:r>
+          </w:p>
+        </w:tc>
+        <w:tc>
+          <w:p>
+            <w:pPr>
+              <w:jc w:val="right"/>
+            </w:pPr>
+            <w:r>
+              <w:rPr>
+                <w:b w:val="false"/>
+                <w:bCs w:val="false"/>
+                <w:sz w:val="20"/>
+                <w:szCs w:val="20"/>
+              </w:rPr>
+              <w:t xml:space="preserve">5400</w:t>
             </w:r>
           </w:p>
         </w:tc>
       </w:tr>
       <w:tr>
         <w:tc>
+          <w:p>
+            <w:pPr>
+              <w:jc w:val="left"/>
+            </w:pPr>
+            <w:r>
+              <w:rPr>
+                <w:b w:val="false"/>
+                <w:bCs w:val="false"/>
+                <w:sz w:val="20"/>
+                <w:szCs w:val="20"/>
+              </w:rPr>
+              <w:t xml:space="preserve">Other</w:t>
+            </w:r>
+          </w:p>
+        </w:tc>
+        <w:tc>
+          <w:p>
+            <w:pPr>
+              <w:jc w:val="left"/>
+            </w:pPr>
+            <w:r>
+              <w:rPr>
+                <w:b w:val="false"/>
+                <w:bCs w:val="false"/>
+                <w:sz w:val="20"/>
+                <w:szCs w:val="20"/>
+              </w:rPr>
+              <w:t xml:space="preserve">SGP30 Air Quality Sensor</w:t>
+            </w:r>
+          </w:p>
+        </w:tc>
+        <w:tc>
+          <w:p>
+            <w:pPr>
+              <w:jc w:val="left"/>
+            </w:pPr>
+            <w:r>
+              <w:rPr>
+                <w:b w:val="false"/>
+                <w:bCs w:val="false"/>
+                <w:sz w:val="20"/>
+                <w:szCs w:val="20"/>
+              </w:rPr>
+              <w:t xml:space="preserve">VOC/CO2 breakout board</w:t>
+            </w:r>
+          </w:p>
+        </w:tc>
+        <w:tc>
+          <w:p>
+            <w:pPr>
+              <w:jc w:val="center"/>
+            </w:pPr>
+            <w:r>
+              <w:rPr>
+                <w:b w:val="false"/>
+                <w:bCs w:val="false"/>
+                <w:sz w:val="20"/>
+                <w:szCs w:val="20"/>
+              </w:rPr>
+              <w:t xml:space="preserve">3</w:t>
+            </w:r>
+          </w:p>
+        </w:tc>
+        <w:tc>
+          <w:p>
+            <w:pPr>
+              <w:jc w:val="center"/>
+            </w:pPr>
+            <w:r>
+              <w:rPr>
+                <w:b w:val="false"/>
+                <w:bCs w:val="false"/>
+                <w:sz w:val="20"/>
+                <w:szCs w:val="20"/>
+              </w:rPr>
+              <w:t xml:space="preserve">Piece</w:t>
+            </w:r>
+          </w:p>
+        </w:tc>
+        <w:tc>
+          <w:p>
+            <w:pPr>
+              <w:jc w:val="right"/>
+            </w:pPr>
+            <w:r>
+              <w:rPr>
+                <w:b w:val="false"/>
+                <w:bCs w:val="false"/>
+                <w:sz w:val="20"/>
+                <w:szCs w:val="20"/>
+              </w:rPr>
+              <w:t xml:space="preserve">850</w:t>
+            </w:r>
+          </w:p>
+        </w:tc>
+        <w:tc>
+          <w:p>
+            <w:pPr>
+              <w:jc w:val="right"/>
+            </w:pPr>
+            <w:r>
+              <w:rPr>
+                <w:b w:val="false"/>
+                <w:bCs w:val="false"/>
+                <w:sz w:val="20"/>
+                <w:szCs w:val="20"/>
+              </w:rPr>
+              <w:t xml:space="preserve">2550</w:t>
+            </w:r>
+          </w:p>
+        </w:tc>
+      </w:tr>
+      <w:tr>
+        <w:tc>
+          <w:tcPr>
+            <w:gridSpan w:val="6"/>
+            <w:shd w:fill="F7F7F7"/>
+          </w:tcPr>
+          <w:p>
+            <w:pPr>
+              <w:jc w:val="right"/>
+            </w:pPr>
+            <w:r>
+              <w:rPr>
+                <w:b/>
+                <w:bCs/>
+                <w:color w:val="4A5568"/>
+                <w:sz w:val="20"/>
+                <w:szCs w:val="20"/>
+              </w:rPr>
+              <w:t xml:space="preserve">Subtotal — MOOE</w:t>
+            </w:r>
+          </w:p>
+        </w:tc>
+        <w:tc>
+          <w:tcPr>
+            <w:shd w:fill="F7F7F7"/>
+          </w:tcPr>
+          <w:p>
+            <w:pPr>
+              <w:jc w:val="right"/>
+            </w:pPr>
+            <w:r>
+              <w:rPr>
+                <w:b/>
+                <w:bCs/>
+                <w:sz w:val="20"/>
+                <w:szCs w:val="20"/>
+              </w:rPr>
+              <w:t xml:space="preserve">45914</w:t>
+            </w:r>
+          </w:p>
+        </w:tc>
+      </w:tr>
+      <w:tr>
+        <w:tc>
           <w:tcPr>
             <w:gridSpan w:val="7"/>
-            <w:shd w:fill="FFF2CC"/>
+            <w:shd w:fill="FDECEE"/>
           </w:tcPr>
           <w:p>
             <w:pPr>
@@ -1749,8 +1856,9 @@
               <w:rPr>
                 <w:b/>
                 <w:bCs/>
-                <w:sz w:val="20"/>
-                <w:szCs w:val="20"/>
+                <w:color w:val="C8102E"/>
+                <w:sz w:val="22"/>
+                <w:szCs w:val="22"/>
               </w:rPr>
               <w:t xml:space="preserve">III. CAPITAL OUTLAY</w:t>
             </w:r>
@@ -2209,6 +2317,91 @@
                 <w:szCs w:val="20"/>
               </w:rPr>
               <w:t xml:space="preserve">7000</w:t>
+            </w:r>
+          </w:p>
+        </w:tc>
+      </w:tr>
+      <w:tr>
+        <w:tc>
+          <w:tcPr>
+            <w:gridSpan w:val="6"/>
+            <w:shd w:fill="F7F7F7"/>
+          </w:tcPr>
+          <w:p>
+            <w:pPr>
+              <w:jc w:val="right"/>
+            </w:pPr>
+            <w:r>
+              <w:rPr>
+                <w:b/>
+                <w:bCs/>
+                <w:color w:val="4A5568"/>
+                <w:sz w:val="20"/>
+                <w:szCs w:val="20"/>
+              </w:rPr>
+              <w:t xml:space="preserve">Subtotal — Capital Outlay</w:t>
+            </w:r>
+          </w:p>
+        </w:tc>
+        <w:tc>
+          <w:tcPr>
+            <w:shd w:fill="F7F7F7"/>
+          </w:tcPr>
+          <w:p>
+            <w:pPr>
+              <w:jc w:val="right"/>
+            </w:pPr>
+            <w:r>
+              <w:rPr>
+                <w:b/>
+                <w:bCs/>
+                <w:sz w:val="20"/>
+                <w:szCs w:val="20"/>
+              </w:rPr>
+              <w:t xml:space="preserve">73000</w:t>
+            </w:r>
+          </w:p>
+        </w:tc>
+      </w:tr>
+      <w:tr>
+        <w:tc>
+          <w:tcPr>
+            <w:gridSpan w:val="6"/>
+            <w:shd w:fill="C8102E"/>
+          </w:tcPr>
+          <w:p>
+            <w:pPr>
+              <w:jc w:val="right"/>
+            </w:pPr>
+            <w:r>
+              <w:rPr>
+                <w:b/>
+                <w:bCs/>
+                <w:color w:val="FFFFFF"/>
+                <w:sz w:val="22"/>
+                <w:szCs w:val="22"/>
+              </w:rPr>
+              <w:t xml:space="preserve">GRAND TOTAL</w:t>
+            </w:r>
+          </w:p>
+        </w:tc>
+        <w:tc>
+          <w:tcPr>
+            <w:shd w:fill="C8102E"/>
+          </w:tcPr>
+          <w:p>
+            <w:pPr>
+              <w:jc w:val="right"/>
+            </w:pPr>
+            <w:r>
+              <w:rPr>
+                <w:b/>
+                <w:bCs/>
+                <w:color w:val="FFFFFF"/>
+                <w:sz w:val="22"/>
+                <w:szCs w:val="22"/>
+              </w:rPr>
+              <w:t xml:space="preserve">200914</w:t>
             </w:r>
           </w:p>
         </w:tc>

</xml_diff>

<commit_message>
feat(lib-template): add subcategory reference section + multi-table parser
</commit_message>
<xml_diff>
--- a/backend/tests/fixtures/wmsu-lib-template-v1-sample.docx
+++ b/backend/tests/fixtures/wmsu-lib-template-v1-sample.docx
@@ -56,7 +56,7 @@
           <w:sz w:val="18"/>
           <w:szCs w:val="18"/>
         </w:rPr>
-        <w:t xml:space="preserve">Subcategory tip: If your item matches a standard subcategory (e.g. "Office Supplies", "Honoraria"), write that. If your item does not fit any standard subcategory, you have three options — all are acceptable: (1) write "Other" and refine it in the form after import, (2) write your own specific label (e.g. "IoT Sensors") and the system keeps it as-is, or (3) leave the cell blank and pick the subcategory in the form after import.</w:t>
+        <w:t xml:space="preserve">Subcategory is optional. The simplest approach: leave it blank and choose the official WMSU subcategory after import — the form dropdown shows the full live list. You can also write your own specific label (e.g. "IoT Sensors") if you prefer, and the system will keep it as-is.</w:t>
       </w:r>
     </w:p>
     <w:p>
@@ -1878,7 +1878,7 @@
                 <w:sz w:val="20"/>
                 <w:szCs w:val="20"/>
               </w:rPr>
-              <w:t xml:space="preserve">ICT Equipment</w:t>
+              <w:t xml:space="preserve">Equipment Outlay</w:t>
             </w:r>
           </w:p>
         </w:tc>
@@ -1992,7 +1992,7 @@
                 <w:sz w:val="20"/>
                 <w:szCs w:val="20"/>
               </w:rPr>
-              <w:t xml:space="preserve">ICT Equipment</w:t>
+              <w:t xml:space="preserve">Equipment Outlay</w:t>
             </w:r>
           </w:p>
         </w:tc>
@@ -2106,7 +2106,7 @@
                 <w:sz w:val="20"/>
                 <w:szCs w:val="20"/>
               </w:rPr>
-              <w:t xml:space="preserve">Semi-expendable Equipment</w:t>
+              <w:t xml:space="preserve">Equipment Outlay</w:t>
             </w:r>
           </w:p>
         </w:tc>
@@ -2220,7 +2220,7 @@
                 <w:sz w:val="20"/>
                 <w:szCs w:val="20"/>
               </w:rPr>
-              <w:t xml:space="preserve">Semi-expendable Equipment</w:t>
+              <w:t xml:space="preserve">Equipment Outlay</w:t>
             </w:r>
           </w:p>
         </w:tc>

</xml_diff>